<commit_message>
Fill legal documents with company details
</commit_message>
<xml_diff>
--- a/output/doc/legal/00_Overzicht_juridisch_pakket_Pure_Grief_and_Therapeutic_ART.docx
+++ b/output/doc/legal/00_Overzicht_juridisch_pakket_Pure_Grief_and_Therapeutic_ART.docx
@@ -27,7 +27,7 @@
         <w:jc w:val="center"/>
       </w:pPr>
       <w:r>
-        <w:t>Exploitant: De Troostboom</w:t>
+        <w:t>Exploitant: De Troostboom®</w:t>
       </w:r>
     </w:p>
     <w:p>
@@ -220,23 +220,7 @@
         <w:pStyle w:val="ListBullet"/>
       </w:pPr>
       <w:r>
-        <w:t>Vestigingsadres: [IN TE VULLEN: vestigingsadres De Troostboom], [IN TE VULLEN: postcode en vestigingsplaats].</w:t>
-      </w:r>
-    </w:p>
-    <w:p>
-      <w:pPr>
-        <w:pStyle w:val="ListBullet"/>
-      </w:pPr>
-      <w:r>
         <w:t>BTW-nummer: [IN TE VULLEN: btw-nummer indien van toepassing].</w:t>
-      </w:r>
-    </w:p>
-    <w:p>
-      <w:pPr>
-        <w:pStyle w:val="ListBullet"/>
-      </w:pPr>
-      <w:r>
-        <w:t>Telefoonnummer of extra contactkanaal: [OPTIONEEL IN TE VULLEN: telefoonnummer].</w:t>
       </w:r>
     </w:p>
     <w:p>

</xml_diff>